<commit_message>
Add team leader signature and date to declaration
</commit_message>
<xml_diff>
--- a/SIH Team Profile_IT(SKCET) - FILLED.docx
+++ b/SIH Team Profile_IT(SKCET) - FILLED.docx
@@ -1495,7 +1495,41 @@
         <w:t>Team Leader Signature:</w:t>
       </w:r>
       <w:r>
-        <w:t xml:space="preserve"> ______________________</w:t>
+        <w:t xml:space="preserve"> </w:t>
+      </w:r>
+      <w:r>
+        <w:drawing>
+          <wp:inline xmlns:a="http://schemas.openxmlformats.org/drawingml/2006/main" xmlns:pic="http://schemas.openxmlformats.org/drawingml/2006/picture">
+            <wp:extent cx="869482" cy="365760"/>
+            <wp:docPr id="1" name="Picture 1"/>
+            <wp:cNvGraphicFramePr>
+              <a:graphicFrameLocks noChangeAspect="1"/>
+            </wp:cNvGraphicFramePr>
+            <a:graphic>
+              <a:graphicData uri="http://schemas.openxmlformats.org/drawingml/2006/picture">
+                <pic:pic>
+                  <pic:nvPicPr>
+                    <pic:cNvPr id="0" name="signature.jpeg"/>
+                    <pic:cNvPicPr/>
+                  </pic:nvPicPr>
+                  <pic:blipFill>
+                    <a:blip r:embed="rId7"/>
+                    <a:stretch>
+                      <a:fillRect/>
+                    </a:stretch>
+                  </pic:blipFill>
+                  <pic:spPr>
+                    <a:xfrm>
+                      <a:off x="0" y="0"/>
+                      <a:ext cx="869482" cy="365760"/>
+                    </a:xfrm>
+                    <a:prstGeom prst="rect"/>
+                  </pic:spPr>
+                </pic:pic>
+              </a:graphicData>
+            </a:graphic>
+          </wp:inline>
+        </w:drawing>
       </w:r>
     </w:p>
     <w:p>
@@ -1510,7 +1544,7 @@
         <w:t>Date:</w:t>
       </w:r>
       <w:r>
-        <w:t xml:space="preserve"> ______________________</w:t>
+        <w:t xml:space="preserve"> 15-09-2026</w:t>
       </w:r>
       <w:bookmarkEnd w:id="0"/>
       <w:bookmarkEnd w:id="1"/>

</xml_diff>